<commit_message>
Add reproducible UrbanPulse demo and fix streaming jobs
</commit_message>
<xml_diff>
--- a/docs/UrbanPulse_Report.docx
+++ b/docs/UrbanPulse_Report.docx
@@ -7555,13 +7555,13 @@
         <w:t xml:space="preserve"> </w:t>
       </w:r>
       <w:r>
-        <w:t xml:space="preserve">(both required, two independent streaming queries on the same</w:t>
-      </w:r>
-      <w:r>
-        <w:t xml:space="preserve"> </w:t>
-      </w:r>
-      <w:r>
-        <w:t xml:space="preserve">aggregated DataFrame):</w:t>
+        <w:t xml:space="preserve">(both required, one checkpointed streaming query fans each</w:t>
+      </w:r>
+      <w:r>
+        <w:t xml:space="preserve"> </w:t>
+      </w:r>
+      <w:r>
+        <w:t xml:space="preserve">finalised micro-batch to both sinks):</w:t>
       </w:r>
     </w:p>
     <w:p>

</xml_diff>